<commit_message>
Add polished PDF briefing; align report Top 5 to measured order
- analysis/build_pdf.py + UK-Rent-Convergence-Briefing.pdf: 7-page reportlab
  briefing (cover, exec summary, Top 20, Top 5, operators, method), visually
  QA'd. Fixes: correct region for fallback areas, ampersand rendering.
- uk-rent-convergence-analysis.md: Section 6 Top 5 replaced with the measured
  order (Teesside-led; Black Country out), Section 5 flagged as superseded.
- README links the briefing.

Co-Authored-By: Claude Opus 4.8 <noreply@anthropic.com>
Claude-Session: https://claude.ai/code/session_0134z6T1johUqsS5iLexF3Jz
</commit_message>
<xml_diff>
--- a/analysis/UK-Rent-Convergence-Briefing.docx
+++ b/analysis/UK-Rent-Convergence-Briefing.docx
@@ -1337,7 +1337,7 @@
                 <w:b w:val="0"/>
                 <w:sz w:val="17"/>
               </w:rPr>
-              <w:t>nan</w:t>
+              <w:t>North West</w:t>
             </w:r>
           </w:p>
         </w:tc>
@@ -2389,7 +2389,7 @@
                 <w:b w:val="0"/>
                 <w:sz w:val="17"/>
               </w:rPr>
-              <w:t>nan</w:t>
+              <w:t>Yorks &amp; Humber</w:t>
             </w:r>
           </w:p>
         </w:tc>

</xml_diff>

<commit_message>
Review briefing wording: accuracy, plain English, UK-policy alignment
- Fix policy clash: LHA was labelled "(benefit cap)"; the Benefit Cap is a
  separate policy. Now "the most housing benefit / Universal Credit pays
  towards rent".
- Affordable Rent: "80% of market" -> "up to 80%" (statutory ceiling).
- Plain-English the score description, mechanism bullets, caveats and chart
  labels (dropped "social-rent attachment" jargon).
- LHA source note: frozen since April 2024, carried forward to 2026/27.
Applied to both PDF and Word builders; charts regenerated.

Co-Authored-By: Claude Opus 4.8 <noreply@anthropic.com>
Claude-Session: https://claude.ai/code/session_0134z6T1johUqsS5iLexF3Jz
</commit_message>
<xml_diff>
--- a/analysis/UK-Rent-Convergence-Briefing.docx
+++ b/analysis/UK-Rent-Convergence-Briefing.docx
@@ -125,7 +125,7 @@
         <w:rPr>
           <w:sz w:val="21"/>
         </w:rPr>
-        <w:t>A screen for English areas where all four rent levels for 1–3 bed homes sit close together — lower rent risk, stronger housing-benefit alignment.</w:t>
+        <w:t>A screen for English areas where all four rent levels for 1–3 bed homes sit close together — lower rent risk, and housing benefit that covers more of the rent.</w:t>
       </w:r>
     </w:p>
     <w:p>
@@ -137,7 +137,7 @@
         <w:rPr>
           <w:sz w:val="21"/>
         </w:rPr>
-        <w:t>Four layers compared: market rent, LHA (benefit cap), Affordable Rent (80% of market), and social rent.</w:t>
+        <w:t>Four rent levels compared: market rent; LHA (the most housing benefit / Universal Credit pays towards rent); Affordable Rent (up to 80% of market); and social rent.</w:t>
       </w:r>
     </w:p>
     <w:p>
@@ -178,7 +178,7 @@
         <w:rPr>
           <w:sz w:val="21"/>
         </w:rPr>
-        <w:t>Convergence is concentrated in the low-cost North &amp; Midlands; the least-converged areas are all in the high-rent South.</w:t>
+        <w:t>Convergence is concentrated in the low-cost North &amp; Midlands; the least-converged areas are all in the higher-rent South.</w:t>
       </w:r>
     </w:p>
     <w:p>
@@ -209,7 +209,7 @@
         <w:rPr>
           <w:sz w:val="21"/>
         </w:rPr>
-        <w:t>The driver is social-rent attachment — near-uniform social rent only sits close to market rent where market rent is low.</w:t>
+        <w:t>Social rents barely vary across England, so they only sit close to market rents where market rents are low.</w:t>
       </w:r>
     </w:p>
     <w:p>
@@ -309,7 +309,7 @@
         <w:rPr>
           <w:sz w:val="21"/>
         </w:rPr>
-        <w:t>LHA close to market rent — benefit-backed demand is well supported.</w:t>
+        <w:t>LHA is close to market rent — so housing-benefit demand is well supported.</w:t>
       </w:r>
     </w:p>
     <w:p>
@@ -321,7 +321,7 @@
         <w:rPr>
           <w:sz w:val="21"/>
         </w:rPr>
-        <w:t>Affordable Rent (80% of market) sits near or below LHA — coverable by a benefit tenant.</w:t>
+        <w:t>Affordable Rent (up to 80% of market) sits near or below LHA — so a tenant on housing benefit / Universal Credit can cover it.</w:t>
       </w:r>
     </w:p>
     <w:p>
@@ -333,7 +333,7 @@
         <w:rPr>
           <w:sz w:val="21"/>
         </w:rPr>
-        <w:t>Social rent not wildly detached from market rent.</w:t>
+        <w:t>Social rent not far below market rent.</w:t>
       </w:r>
     </w:p>
     <w:p>
@@ -345,7 +345,7 @@
         <w:rPr>
           <w:sz w:val="21"/>
         </w:rPr>
-        <w:t>1/2/3-bed rents relatively compressed (low variation).</w:t>
+        <w:t>The 1/2/3-bed rents are fairly consistent (low variation).</w:t>
       </w:r>
     </w:p>
     <w:p>
@@ -355,7 +355,7 @@
           <w:color w:val="606060"/>
           <w:sz w:val="19"/>
         </w:rPr>
-        <w:t>Score = 0.40 × LHA-alignment + 0.30 × social-attachment + 0.30 × rent-compression (0–1; higher = tighter).</w:t>
+        <w:t>Score (0–1, higher = tighter): 40% how close LHA is to market rent, 30% how close social rent is to market rent, 30% how consistent the 1–3 bed rents are.</w:t>
       </w:r>
     </w:p>
     <w:p>
@@ -365,7 +365,7 @@
           <w:color w:val="2C6E9E"/>
           <w:sz w:val="24"/>
         </w:rPr>
-        <w:t>The mechanism the data exposes</w:t>
+        <w:t>The pattern the data reveals</w:t>
       </w:r>
     </w:p>
     <w:p>
@@ -377,7 +377,7 @@
         <w:rPr>
           <w:sz w:val="21"/>
         </w:rPr>
-        <w:t>LHA-to-market alignment is high almost everywhere — LHA is the 30th percentile by design (even Cambridge, Guildford score well).</w:t>
+        <w:t>LHA sits close to market rent almost everywhere — it is set at the 30th percentile of local rents, so even Cambridge and Guildford score well on this alone.</w:t>
       </w:r>
     </w:p>
     <w:p>
@@ -389,7 +389,7 @@
         <w:rPr>
           <w:sz w:val="21"/>
         </w:rPr>
-        <w:t>Social rent barely varies nationally (~£380–£490/mo here) but market rent ranges ~£475–£1,400.</w:t>
+        <w:t>Social rent barely varies nationally (~£380–£490/mo here), while market rent ranges from ~£475 to ~£1,400.</w:t>
       </w:r>
     </w:p>
     <w:p>
@@ -408,7 +408,7 @@
         <w:rPr>
           <w:sz w:val="21"/>
         </w:rPr>
-        <w:t>So four-layer convergence needs a low-rent market — the northern signature.</w:t>
+        <w:t>So all four rent levels only line up where market rents are low — the northern signature.</w:t>
       </w:r>
     </w:p>
     <w:p>
@@ -418,7 +418,7 @@
       <w:r>
         <w:drawing>
           <wp:inline xmlns:a="http://schemas.openxmlformats.org/drawingml/2006/main" xmlns:pic="http://schemas.openxmlformats.org/drawingml/2006/picture">
-            <wp:extent cx="5669280" cy="3865658"/>
+            <wp:extent cx="5669280" cy="3687296"/>
             <wp:docPr id="2" name="Picture 2"/>
             <wp:cNvGraphicFramePr>
               <a:graphicFrameLocks noChangeAspect="1"/>
@@ -439,7 +439,7 @@
                   <pic:spPr>
                     <a:xfrm>
                       <a:off x="0" y="0"/>
-                      <a:ext cx="5669280" cy="3865658"/>
+                      <a:ext cx="5669280" cy="3687296"/>
                     </a:xfrm>
                     <a:prstGeom prst="rect"/>
                   </pic:spPr>
@@ -3267,7 +3267,7 @@
           <w:color w:val="606060"/>
           <w:sz w:val="17"/>
         </w:rPr>
-        <w:t>Rents matched to the LHA reference window (Oct 2022–Sep 2023); measures structural convergence, not today's live gap. Full 97-area table in the accompanying spreadsheet/CSV.</w:t>
+        <w:t>Market rents are from the same period the frozen LHA is based on (Oct 2022–Sep 2023), so this shows how closely the layers are designed to sit — today's gap between market rent and LHA is wider. Full 97-area table in the accompanying spreadsheet/CSV.</w:t>
       </w:r>
     </w:p>
     <w:p/>
@@ -3550,7 +3550,7 @@
         <w:rPr>
           <w:sz w:val="21"/>
         </w:rPr>
-        <w:t>Strong convergence plus Riverside regeneration and automotive employment.</w:t>
+        <w:t>Strong convergence plus the Riverside Sunderland regeneration and automotive employment.</w:t>
       </w:r>
     </w:p>
     <w:p>
@@ -5065,7 +5065,7 @@
         <w:rPr>
           <w:sz w:val="21"/>
         </w:rPr>
-        <w:t>LHA — DWP/VOA April-2024 rates (frozen), 1/2/3-bed, by BRMA.</w:t>
+        <w:t>LHA — DWP/VOA rates set in April 2024 and frozen since (carried forward to 2026/27), 1/2/3-bed, by Broad Rental Market Area.</w:t>
       </w:r>
     </w:p>
     <w:p>
@@ -5077,7 +5077,7 @@
         <w:rPr>
           <w:sz w:val="21"/>
         </w:rPr>
-        <w:t>Social rent — Regulator of Social Housing 2024/25: per-LA, per-bedsize general-needs rent.</w:t>
+        <w:t>Social rent — Regulator of Social Housing 2024/25: per-local-authority, per-bed-size general-needs rent.</w:t>
       </w:r>
     </w:p>
     <w:p>
@@ -5089,7 +5089,7 @@
         <w:rPr>
           <w:sz w:val="21"/>
         </w:rPr>
-        <w:t>Affordable Rent — derived as 80% of market (statutory definition).</w:t>
+        <w:t>Affordable Rent — estimated at 80% of market (the policy ceiling is 'up to 80%').</w:t>
       </w:r>
     </w:p>
     <w:p>
@@ -5157,7 +5157,7 @@
         <w:rPr>
           <w:sz w:val="21"/>
         </w:rPr>
-        <w:t>Structural, not live — rents matched to the frozen-LHA window; today's market-vs-LHA gap is wider.</w:t>
+        <w:t>Shows the designed alignment, not the current gap — rents are from the period the frozen LHA is based on; today's market-vs-LHA gap is wider.</w:t>
       </w:r>
     </w:p>
     <w:p>
@@ -5169,7 +5169,7 @@
         <w:rPr>
           <w:sz w:val="21"/>
         </w:rPr>
-        <w:t>A convergence screen, not a demand / yield / asset-quality model — pair with local demand work.</w:t>
+        <w:t>A rent-alignment screen, not a demand, yield or building-quality model — pair with local demand work.</w:t>
       </w:r>
     </w:p>
     <w:p>
@@ -5181,7 +5181,7 @@
         <w:rPr>
           <w:sz w:val="21"/>
         </w:rPr>
-        <w:t>Small-sample areas flagged in the data; treat cautiously.</w:t>
+        <w:t>Small-sample areas are flagged in the data; treat cautiously.</w:t>
       </w:r>
     </w:p>
     <w:p>
@@ -5193,7 +5193,7 @@
         <w:rPr>
           <w:sz w:val="21"/>
         </w:rPr>
-        <w:t>97 areas scored (not all ~300) — full national coverage needs the official LA→BRMA lookup.</w:t>
+        <w:t>97 areas scored (not all ~300) — full national coverage needs the official local-authority-to-BRMA lookup.</w:t>
       </w:r>
     </w:p>
     <w:p>

</xml_diff>